<commit_message>
Expand report to required page count
Co-authored-by: Galiya <agielson@users.noreply.github.com>
</commit_message>
<xml_diff>
--- a/reports/referat_vtoraya_chast_matrica_kompetenciy.docx
+++ b/reports/referat_vtoraya_chast_matrica_kompetenciy.docx
@@ -3953,6 +3953,61 @@
     </w:p>
     <w:p>
       <w:pPr>
+        <w:pStyle w:val="Heading2"/>
+      </w:pPr>
+      <w:r>
+        <w:t>3.5. Руководство администратора</w:t>
+      </w:r>
+    </w:p>
+    <w:p>
+      <w:pPr>
+        <w:spacing w:line="360" w:lineRule="auto"/>
+        <w:ind w:firstLine="709"/>
+      </w:pPr>
+      <w:r>
+        <w:rPr>
+          <w:rFonts w:ascii="Times New Roman" w:hAnsi="Times New Roman"/>
+          <w:b w:val="0"/>
+          <w:sz w:val="28"/>
+        </w:rPr>
+        <w:t>При первичной установке администратор проверяет наличие сетевого взаимодействия между контейнерами. FastAPI должен обращаться к PostgreSQL по имени сервиса db, Superset должен видеть тот же источник данных, а Airflow должен иметь доступ к скриптам parser и dbt-проекту.</w:t>
+      </w:r>
+    </w:p>
+    <w:p>
+      <w:pPr>
+        <w:spacing w:line="360" w:lineRule="auto"/>
+        <w:ind w:firstLine="709"/>
+      </w:pPr>
+      <w:r>
+        <w:rPr>
+          <w:rFonts w:ascii="Times New Roman" w:hAnsi="Times New Roman"/>
+          <w:b w:val="0"/>
+          <w:sz w:val="28"/>
+        </w:rPr>
+        <w:t>Порядок диагностики инцидентов начинается с проверки /health, затем логов FastAPI, состояния PostgreSQL и последнего запуска Airflow DAG. Если ошибка возникает только в аналитике, необходимо отдельно проверить dbt-модели и подключение Superset к витринам.</w:t>
+      </w:r>
+    </w:p>
+    <w:p>
+      <w:pPr>
+        <w:spacing w:line="360" w:lineRule="auto"/>
+        <w:ind w:firstLine="709"/>
+      </w:pPr>
+      <w:r>
+        <w:rPr>
+          <w:rFonts w:ascii="Times New Roman" w:hAnsi="Times New Roman"/>
+          <w:b w:val="0"/>
+          <w:sz w:val="28"/>
+        </w:rPr>
+        <w:t>Регламент сопровождения включает контроль свободного места на volume PostgreSQL, периодическую проверку резервных копий, обновление базового образа контейнеров и ревизию учетных записей. Такой порядок снижает риск потери данных и упрощает восстановление после сбоя.</w:t>
+      </w:r>
+    </w:p>
+    <w:p>
+      <w:r>
+        <w:br w:type="page"/>
+      </w:r>
+    </w:p>
+    <w:p>
+      <w:pPr>
         <w:pStyle w:val="Heading1"/>
       </w:pPr>
       <w:r>

</xml_diff>